<commit_message>
CET-16/D21: consistency tracker (heatmap + 7/30/90 score) in the mock
Add a longitudinal "how steadfast are you" view — the in-app surface for
the North Star (70%+ group consistency over 90 days). Distinct from streaks
(momentum) and the leaderboard (week rank): the pattern over time.

- new /progress screen + ConsistencyHeatmap (GitHub-style emerald grid;
  intensity = share of that day's rings closed; missed = neutral, never red)
- 7/30/90-day consistency score + longest streak; group 90-day rollup ring;
  group-admin oversight bars (sorted) when viewing as group_admin/admin
- store selectors: dayCompletion, heatmap, consistency, memberConsistency,
  groupConsistency
- seed extended to 90 days of per-member history with distinct diligence;
  mock STORAGE_VERSION -> 2 forces a reseed
- nav gains a 5th Progress item (bottom bar + sidebar); GridIcon added
- PRD §4/§5/§6/§9 updated + .docx regenerated (script content mirrored)

Co-Authored-By: Claude Opus 4.8 <noreply@anthropic.com>
</commit_message>
<xml_diff>
--- a/docs/PRD.docx
+++ b/docs/PRD.docx
@@ -860,6 +860,26 @@
         <w:rPr>
           <w:b/>
         </w:rPr>
+        <w:t xml:space="preserve">Consistency tracker — </w:t>
+      </w:r>
+      <w:r>
+        <w:rPr/>
+        <w:t xml:space="preserve">how steadfast each member is over time (the North Star, made visible in-app): a GitHub-style calendar heatmap of daily completion (green intensity = % of that day's tasks closed) + a headline consistency score (% of days fully completed over 7 / 30 / 90 days) + longest streak. Three views — personal (self-reflection), group-admin oversight (every member's consistency, to spot who's slipping and follow up), and group collective rollup (the group's 90-day figure, shown to all). Distinct from streaks (momentum) and the leaderboard (this-week rank): the pattern over time. Derived from logs vs targets; forgiveness-framed, no FOMO.</w:t>
+      </w:r>
+    </w:p>
+    <w:p>
+      <w:pPr>
+        <w:pStyle w:val="ListBullet"/>
+        <w:numPr>
+          <w:ilvl w:val="0"/>
+          <w:numId w:val="1"/>
+        </w:numPr>
+        <w:spacing w:after="60"/>
+      </w:pPr>
+      <w:r>
+        <w:rPr>
+          <w:b/>
+        </w:rPr>
         <w:t xml:space="preserve">Variable-reward milestones — </w:t>
       </w:r>
       <w:r>
@@ -1286,6 +1306,53 @@
             </w:pPr>
             <w:r>
               <w:rPr/>
+              <w:t xml:space="preserve">Steadfastness</w:t>
+            </w:r>
+          </w:p>
+        </w:tc>
+        <w:tc>
+          <w:tcPr>
+            <w:tcW w:w="2200" w:type="dxa"/>
+            <w:vAlign w:val="center"/>
+          </w:tcPr>
+          <w:p>
+            <w:pPr>
+              <w:spacing w:before="40" w:after="40"/>
+            </w:pPr>
+            <w:r>
+              <w:rPr/>
+              <w:t xml:space="preserve">durable</w:t>
+            </w:r>
+          </w:p>
+        </w:tc>
+        <w:tc>
+          <w:tcPr>
+            <w:tcW w:w="4560" w:type="dxa"/>
+            <w:vAlign w:val="center"/>
+          </w:tcPr>
+          <w:p>
+            <w:pPr>
+              <w:spacing w:before="40" w:after="40"/>
+            </w:pPr>
+            <w:r>
+              <w:rPr/>
+              <w:t xml:space="preserve">Consistency tracker — heatmap + 7/30/90-day score (personal, admin, group)</w:t>
+            </w:r>
+          </w:p>
+        </w:tc>
+      </w:tr>
+      <w:tr>
+        <w:tc>
+          <w:tcPr>
+            <w:tcW w:w="2600" w:type="dxa"/>
+            <w:vAlign w:val="center"/>
+          </w:tcPr>
+          <w:p>
+            <w:pPr>
+              <w:spacing w:before="40" w:after="40"/>
+            </w:pPr>
+            <w:r>
+              <w:rPr/>
               <w:t xml:space="preserve">Forgiveness</w:t>
             </w:r>
           </w:p>
@@ -1548,6 +1615,21 @@
           <w:i/>
         </w:rPr>
         <w:t xml:space="preserve">Row-Level Security on every table: members read their group, admins write their group.</w:t>
+      </w:r>
+    </w:p>
+    <w:p>
+      <w:pPr>
+        <w:spacing w:before="60" w:after="120"/>
+      </w:pPr>
+      <w:r>
+        <w:rPr>
+          <w:b/>
+        </w:rPr>
+        <w:t xml:space="preserve">Consistency tracker</w:t>
+      </w:r>
+      <w:r>
+        <w:rPr/>
+        <w:t xml:space="preserve"> needs no new table — derived from logs (count per user / item / date) vs each item's target_count: a day's completion % = closed rings ÷ total tasks; the 7/30/90-day score = % of days fully completed; the group rollup aggregates across members. Optionally precompute a daily_completion materialized view (user_id, group_id, date, pct) for scale.</w:t>
       </w:r>
     </w:p>
     <w:p>
@@ -2142,6 +2224,15 @@
       <w:r>
         <w:rPr/>
         <w:t xml:space="preserve">70%+ consistency across a group over 90 days — showing up, not perfection.</w:t>
+      </w:r>
+    </w:p>
+    <w:p>
+      <w:pPr>
+        <w:spacing w:before="40" w:after="120"/>
+      </w:pPr>
+      <w:r>
+        <w:rPr/>
+        <w:t xml:space="preserve">The consistency tracker (§4) is the in-app surface for these metrics — what's measured for success is also what members and admins see, so the product and the goal stay aligned.</w:t>
       </w:r>
     </w:p>
     <w:sectPr>

</xml_diff>

<commit_message>
docs(research): retention research + v2 feature roadmap (PRD + Linear)
Add research/ (competitive landscape, motivation & reward-design science,
and the synthesis/decision doc) and document the resulting features.

- research/01 — daily-reminder & progress-tracking app gap analysis
  (Duolingo, Habitica, Finch, Forest, Streaks, Muslim Salah apps)
- research/02 — psychology of returning daily (dopamine, loss aversion,
  goal-gradient, SDT, Fogg, Hook, Octalysis) → reward ladder + level-of-
  abstraction rules + ethics guardrails + backlog
- research/03 — synthesis: prioritised "what to build", incl. the group
  garden (the "accountability pet" evolved to a collective form)
- PRD §4 gains a "v2 — retention deepening" section + §5 levers; docx
  regenerated (script mirrored)
- STATUS points to the new Linear issues CET-17..CET-22

Co-Authored-By: Claude Opus 4.8 <noreply@anthropic.com>
</commit_message>
<xml_diff>
--- a/docs/PRD.docx
+++ b/docs/PRD.docx
@@ -978,6 +978,152 @@
           <w:szCs w:val="28"/>
           <w:rFonts w:ascii="Calibri" w:hAnsi="Calibri"/>
         </w:rPr>
+        <w:t xml:space="preserve">v2 — retention deepening (research-backed)</w:t>
+      </w:r>
+    </w:p>
+    <w:p>
+      <w:pPr>
+        <w:spacing w:before="0" w:after="120"/>
+      </w:pPr>
+      <w:r>
+        <w:rPr/>
+        <w:t xml:space="preserve">From research/03-feature-recommendations.md (links the motivation science in research/02 to the competitive gaps in research/01). Top priority is to promote two already-scoped items: variable-reward milestones (v1) and reminders + habit-stacking (v1.1).</w:t>
+      </w:r>
+    </w:p>
+    <w:p>
+      <w:pPr>
+        <w:pStyle w:val="ListBullet"/>
+        <w:numPr>
+          <w:ilvl w:val="0"/>
+          <w:numId w:val="1"/>
+        </w:numPr>
+        <w:spacing w:after="60"/>
+      </w:pPr>
+      <w:r>
+        <w:rPr>
+          <w:b/>
+        </w:rPr>
+        <w:t xml:space="preserve">Group garden (collective living artefact) — </w:t>
+      </w:r>
+      <w:r>
+        <w:rPr/>
+        <w:t xml:space="preserve">a shared garden per circle that grows as the group completes its rings and goes calmly dormant (never shaming) when activity drops. The emotional/identity layer Cetele lacks — built on the group, not a solo avatar, so it reinforces accountability; jannah/garden imagery suits a worship app. Optional personal “your corner” plant. Levers: ownership + relatedness; precedent: Finch / Forest.</w:t>
+      </w:r>
+    </w:p>
+    <w:p>
+      <w:pPr>
+        <w:pStyle w:val="ListBullet"/>
+        <w:numPr>
+          <w:ilvl w:val="0"/>
+          <w:numId w:val="1"/>
+        </w:numPr>
+        <w:spacing w:after="60"/>
+      </w:pPr>
+      <w:r>
+        <w:rPr>
+          <w:b/>
+        </w:rPr>
+        <w:t xml:space="preserve">One-tap peer reactions — </w:t>
+      </w:r>
+      <w:r>
+        <w:rPr/>
+        <w:t xml:space="preserve">send a quick dua / “barakAllahu feek” / heart when a peer closes their rings. Near-zero-effort relatedness spark. Precedent: Strava kudos.</w:t>
+      </w:r>
+    </w:p>
+    <w:p>
+      <w:pPr>
+        <w:pStyle w:val="ListBullet"/>
+        <w:numPr>
+          <w:ilvl w:val="0"/>
+          <w:numId w:val="1"/>
+        </w:numPr>
+        <w:spacing w:after="60"/>
+      </w:pPr>
+      <w:r>
+        <w:rPr>
+          <w:b/>
+        </w:rPr>
+        <w:t xml:space="preserve">Fresh-start re-engagement — </w:t>
+      </w:r>
+      <w:r>
+        <w:rPr/>
+        <w:t xml:space="preserve">re-invite lapsed members on temporal landmarks (Hijri new month, Ramadan, week start) with a clean-slate framing. Lever: fresh-start effect.</w:t>
+      </w:r>
+    </w:p>
+    <w:p>
+      <w:pPr>
+        <w:pStyle w:val="ListBullet"/>
+        <w:numPr>
+          <w:ilvl w:val="0"/>
+          <w:numId w:val="1"/>
+        </w:numPr>
+        <w:spacing w:after="60"/>
+      </w:pPr>
+      <w:r>
+        <w:rPr>
+          <w:b/>
+        </w:rPr>
+        <w:t xml:space="preserve">Achievement badges — </w:t>
+      </w:r>
+      <w:r>
+        <w:rPr/>
+        <w:t xml:space="preserve">streak landmarks (7 / 30 / 100 days) + monthly awards; earned and escalating, never saturating. Precedent: Apple Fitness awards.</w:t>
+      </w:r>
+    </w:p>
+    <w:p>
+      <w:pPr>
+        <w:pStyle w:val="ListBullet"/>
+        <w:numPr>
+          <w:ilvl w:val="0"/>
+          <w:numId w:val="1"/>
+        </w:numPr>
+        <w:spacing w:after="60"/>
+      </w:pPr>
+      <w:r>
+        <w:rPr>
+          <w:b/>
+        </w:rPr>
+        <w:t xml:space="preserve">Endowed-progress onboarding — </w:t>
+      </w:r>
+      <w:r>
+        <w:rPr/>
+        <w:t xml:space="preserve">new members/groups start visibly “part-way” so day one feels like momentum, not a cold start. Lever: endowed-progress effect.</w:t>
+      </w:r>
+    </w:p>
+    <w:p>
+      <w:pPr>
+        <w:pStyle w:val="ListBullet"/>
+        <w:numPr>
+          <w:ilvl w:val="0"/>
+          <w:numId w:val="1"/>
+        </w:numPr>
+        <w:spacing w:after="60"/>
+      </w:pPr>
+      <w:r>
+        <w:rPr>
+          <w:b/>
+        </w:rPr>
+        <w:t xml:space="preserve">Winnable sub-group / pair goals — </w:t>
+      </w:r>
+      <w:r>
+        <w:rPr/>
+        <w:t xml:space="preserve">shared goals for two friends or a sub-group instead of one whole-group ranking, keeping competition winnable and intrinsic.</w:t>
+      </w:r>
+    </w:p>
+    <w:p>
+      <w:pPr>
+        <w:pStyle w:val="Heading2"/>
+        <w:keepNext/>
+        <w:spacing w:before="240" w:after="120"/>
+      </w:pPr>
+      <w:r>
+        <w:rPr>
+          <w:b/>
+          <w:color w:val="1F7A5A"/>
+          <w:sz w:val="28"/>
+          <w:szCs w:val="28"/>
+          <w:rFonts w:ascii="Calibri" w:hAnsi="Calibri"/>
+        </w:rPr>
         <w:t xml:space="preserve">Later / maybe</w:t>
       </w:r>
     </w:p>
@@ -992,7 +1138,7 @@
       </w:pPr>
       <w:r>
         <w:rPr/>
-        <w:t xml:space="preserve">Multiple groups per user · weekly group goals · history/stats charts · Ramadan mode · audio dhikr</w:t>
+        <w:t xml:space="preserve">Multiple groups per user · weekly group goals · history/stats charts · Ramadan mode · audio dhikr · levels/XP · avatar &amp; theme customisation</w:t>
       </w:r>
     </w:p>
     <w:p>
@@ -1431,6 +1577,194 @@
             <w:r>
               <w:rPr/>
               <w:t xml:space="preserve">Visible group peers (the cetele itself)</w:t>
+            </w:r>
+          </w:p>
+        </w:tc>
+      </w:tr>
+      <w:tr>
+        <w:tc>
+          <w:tcPr>
+            <w:tcW w:w="2600" w:type="dxa"/>
+            <w:vAlign w:val="center"/>
+          </w:tcPr>
+          <w:p>
+            <w:pPr>
+              <w:spacing w:before="40" w:after="40"/>
+            </w:pPr>
+            <w:r>
+              <w:rPr/>
+              <w:t xml:space="preserve">Trigger</w:t>
+            </w:r>
+          </w:p>
+        </w:tc>
+        <w:tc>
+          <w:tcPr>
+            <w:tcW w:w="2200" w:type="dxa"/>
+            <w:vAlign w:val="center"/>
+          </w:tcPr>
+          <w:p>
+            <w:pPr>
+              <w:spacing w:before="40" w:after="40"/>
+            </w:pPr>
+            <w:r>
+              <w:rPr/>
+              <w:t xml:space="preserve">dopamine</w:t>
+            </w:r>
+          </w:p>
+        </w:tc>
+        <w:tc>
+          <w:tcPr>
+            <w:tcW w:w="4560" w:type="dxa"/>
+            <w:vAlign w:val="center"/>
+          </w:tcPr>
+          <w:p>
+            <w:pPr>
+              <w:spacing w:before="40" w:after="40"/>
+            </w:pPr>
+            <w:r>
+              <w:rPr/>
+              <w:t xml:space="preserve">(v1.1) Daily reminders + habit-stacking ("after Fajr…")</w:t>
+            </w:r>
+          </w:p>
+        </w:tc>
+      </w:tr>
+      <w:tr>
+        <w:tc>
+          <w:tcPr>
+            <w:tcW w:w="2600" w:type="dxa"/>
+            <w:vAlign w:val="center"/>
+          </w:tcPr>
+          <w:p>
+            <w:pPr>
+              <w:spacing w:before="40" w:after="40"/>
+            </w:pPr>
+            <w:r>
+              <w:rPr/>
+              <w:t xml:space="preserve">Ownership</w:t>
+            </w:r>
+          </w:p>
+        </w:tc>
+        <w:tc>
+          <w:tcPr>
+            <w:tcW w:w="2200" w:type="dxa"/>
+            <w:vAlign w:val="center"/>
+          </w:tcPr>
+          <w:p>
+            <w:pPr>
+              <w:spacing w:before="40" w:after="40"/>
+            </w:pPr>
+            <w:r>
+              <w:rPr/>
+              <w:t xml:space="preserve">durable</w:t>
+            </w:r>
+          </w:p>
+        </w:tc>
+        <w:tc>
+          <w:tcPr>
+            <w:tcW w:w="4560" w:type="dxa"/>
+            <w:vAlign w:val="center"/>
+          </w:tcPr>
+          <w:p>
+            <w:pPr>
+              <w:spacing w:before="40" w:after="40"/>
+            </w:pPr>
+            <w:r>
+              <w:rPr/>
+              <w:t xml:space="preserve">(v2) Group garden — a collective artefact that grows with the group</w:t>
+            </w:r>
+          </w:p>
+        </w:tc>
+      </w:tr>
+      <w:tr>
+        <w:tc>
+          <w:tcPr>
+            <w:tcW w:w="2600" w:type="dxa"/>
+            <w:vAlign w:val="center"/>
+          </w:tcPr>
+          <w:p>
+            <w:pPr>
+              <w:spacing w:before="40" w:after="40"/>
+            </w:pPr>
+            <w:r>
+              <w:rPr/>
+              <w:t xml:space="preserve">Peer encouragement</w:t>
+            </w:r>
+          </w:p>
+        </w:tc>
+        <w:tc>
+          <w:tcPr>
+            <w:tcW w:w="2200" w:type="dxa"/>
+            <w:vAlign w:val="center"/>
+          </w:tcPr>
+          <w:p>
+            <w:pPr>
+              <w:spacing w:before="40" w:after="40"/>
+            </w:pPr>
+            <w:r>
+              <w:rPr/>
+              <w:t xml:space="preserve">accountability</w:t>
+            </w:r>
+          </w:p>
+        </w:tc>
+        <w:tc>
+          <w:tcPr>
+            <w:tcW w:w="4560" w:type="dxa"/>
+            <w:vAlign w:val="center"/>
+          </w:tcPr>
+          <w:p>
+            <w:pPr>
+              <w:spacing w:before="40" w:after="40"/>
+            </w:pPr>
+            <w:r>
+              <w:rPr/>
+              <w:t xml:space="preserve">(v2) One-tap dua / kudos reactions on a peer's completion</w:t>
+            </w:r>
+          </w:p>
+        </w:tc>
+      </w:tr>
+      <w:tr>
+        <w:tc>
+          <w:tcPr>
+            <w:tcW w:w="2600" w:type="dxa"/>
+            <w:vAlign w:val="center"/>
+          </w:tcPr>
+          <w:p>
+            <w:pPr>
+              <w:spacing w:before="40" w:after="40"/>
+            </w:pPr>
+            <w:r>
+              <w:rPr/>
+              <w:t xml:space="preserve">Re-engagement</w:t>
+            </w:r>
+          </w:p>
+        </w:tc>
+        <w:tc>
+          <w:tcPr>
+            <w:tcW w:w="2200" w:type="dxa"/>
+            <w:vAlign w:val="center"/>
+          </w:tcPr>
+          <w:p>
+            <w:pPr>
+              <w:spacing w:before="40" w:after="40"/>
+            </w:pPr>
+            <w:r>
+              <w:rPr/>
+              <w:t xml:space="preserve">durable</w:t>
+            </w:r>
+          </w:p>
+        </w:tc>
+        <w:tc>
+          <w:tcPr>
+            <w:tcW w:w="4560" w:type="dxa"/>
+            <w:vAlign w:val="center"/>
+          </w:tcPr>
+          <w:p>
+            <w:pPr>
+              <w:spacing w:before="40" w:after="40"/>
+            </w:pPr>
+            <w:r>
+              <w:rPr/>
+              <w:t xml:space="preserve">(v2) Fresh-start prompts (Hijri new month, Ramadan, week start)</w:t>
             </w:r>
           </w:p>
         </w:tc>

</xml_diff>

<commit_message>
docs(PRD/STATUS): sync spec to D28/D29/D30 shipped features
PRD §2/§4/§5/§6 + regenerated .docx + the docx generator now reflect:
- D29 admin proxy-logging (admins log on members' behalf, attributed + audited;
  "log for the group" tally; logs.logged_by; oversight grid is editable, not
  read-only)
- D28 consistency trim (personal 7/30/90 → one abstracted 30-day band; 14-day
  grid + group 90-day North Star kept)
- D30 custom reminders (member-set per-task times; reminders table; dropped
  fixed prayer-anchoring)

STATUS: next-steps table (CET-24 Done; CET-16/CET-11 notes) + a 2026-06-27
Linear-sync entry.

Co-Authored-By: Claude Opus 4.8 <noreply@anthropic.com>
</commit_message>
<xml_diff>
--- a/docs/PRD.docx
+++ b/docs/PRD.docx
@@ -490,7 +490,7 @@
             </w:pPr>
             <w:r>
               <w:rPr/>
-              <w:t xml:space="preserve">Everything a member can + edit the group's task list &amp; targets, invite/remove members, promote members, re-share the group</w:t>
+              <w:t xml:space="preserve">Everything a member can + edit the group's task list &amp; targets, invite/remove members, promote members, re-share the group, and log counts on a member's behalf (attributed + audited — the in-person halaqah tally; D29)</w:t>
             </w:r>
           </w:p>
         </w:tc>
@@ -891,7 +891,7 @@
       </w:r>
       <w:r>
         <w:rPr/>
-        <w:t xml:space="preserve">how steadfast each member is over time (the North Star, made visible in-app): a GitHub-style calendar heatmap of daily completion (green intensity = % of that day's tasks closed) + a headline consistency score (% of days fully completed over 7 / 30 / 90 days) + longest streak. Three views — personal (self-reflection), group-admin oversight (every member's consistency, to spot who's slipping and follow up — tapping a member opens a per-task fortnight breakdown, each task x the last 14 days with exact count vs target, so an admin can ask about specific days; read-only, forgiveness-framed), and group collective rollup (the group's 90-day figure, shown to all). Distinct from streaks (momentum) and the leaderboard (this-week rank): the pattern over time. Derived from logs vs targets; forgiveness-framed, no FOMO.</w:t>
+        <w:t xml:space="preserve">how steadfast each member is over time (the North Star, made visible in-app): a 14-day task-by-task grid (each task x day, green intensity = % of that day's target hit) + a headline 30-day consistency band (a calm word + %, abstracted — "Steady · 83%" — not a raw 7/30/90 grade; D28) + longest streak. Three views — personal (self-reflection; members can correct their own past counts in the grid), group-admin oversight (every member's 30-day consistency, to spot who's slipping — tapping a member opens a per-task fortnight breakdown, each task x the last 14 days with exact count vs target, so an admin can ask about specific days; forgiveness-framed; admins may also log on the member's behalf, every proxy entry attributed and audited — D29 — plus a 'log for the group' quick action for the in-person halaqah), and group collective rollup (the group's 90-day figure, shown to all). Distinct from streaks (momentum) and the leaderboard (this-week rank): the pattern over time. Derived from logs vs targets; forgiveness-framed, no FOMO.</w:t>
       </w:r>
     </w:p>
     <w:p>
@@ -984,11 +984,11 @@
         <w:rPr>
           <w:b/>
         </w:rPr>
-        <w:t xml:space="preserve">Habit-stacking reminders — </w:t>
-      </w:r>
-      <w:r>
-        <w:rPr/>
-        <w:t xml:space="preserve">"After Fajr…"</w:t>
+        <w:t xml:space="preserve">Custom daily reminders (D30) — </w:t>
+      </w:r>
+      <w:r>
+        <w:rPr/>
+        <w:t xml:space="preserve">each member sets a per-task reminder time (their own clock time, toggle on/off), not a fixed prayer anchor — flexibility over rigid habit-stacking. The in-app timing UI ships now; delivery rides the Web Push / email above. Prayer-time quick-fill presets can layer on later as an optional shortcut.</w:t>
       </w:r>
     </w:p>
     <w:p>
@@ -1509,7 +1509,7 @@
             </w:pPr>
             <w:r>
               <w:rPr/>
-              <w:t xml:space="preserve">Consistency tracker — heatmap + 7/30/90-day score (personal, admin, group)</w:t>
+              <w:t xml:space="preserve">Consistency tracker — 14-day grid + 30-day band (personal/admin) + 90-day group rollup</w:t>
             </w:r>
           </w:p>
         </w:tc>
@@ -1650,7 +1650,7 @@
             </w:pPr>
             <w:r>
               <w:rPr/>
-              <w:t xml:space="preserve">(v1.1) Daily reminders + habit-stacking ("after Fajr…")</w:t>
+              <w:t xml:space="preserve">(v1.1) Daily reminders — member-set custom per-task times (D30)</w:t>
             </w:r>
           </w:p>
         </w:tc>
@@ -1944,7 +1944,27 @@
       </w:r>
       <w:r>
         <w:rPr/>
-        <w:t xml:space="preserve">id, user_id, task_id, count, date</w:t>
+        <w:t xml:space="preserve">id, user_id, task_id, count, date, logged_by (nullable — the admin who logged it on the member's behalf; null = self; D29)</w:t>
+      </w:r>
+    </w:p>
+    <w:p>
+      <w:pPr>
+        <w:pStyle w:val="ListBullet"/>
+        <w:numPr>
+          <w:ilvl w:val="0"/>
+          <w:numId w:val="1"/>
+        </w:numPr>
+        <w:spacing w:after="60"/>
+      </w:pPr>
+      <w:r>
+        <w:rPr>
+          <w:b/>
+        </w:rPr>
+        <w:t xml:space="preserve">reminders — </w:t>
+      </w:r>
+      <w:r>
+        <w:rPr/>
+        <w:t xml:space="preserve">user_id, task_id, time (HH:MM), on — personal per-task custom reminder times (D30)</w:t>
       </w:r>
     </w:p>
     <w:p>
@@ -2050,7 +2070,7 @@
       </w:r>
       <w:r>
         <w:rPr/>
-        <w:t xml:space="preserve"> needs no new table — derived from logs (count per user / item / date) vs each item's target_count: a day's completion % = closed rings ÷ total tasks; the 7/30/90-day score = % of days fully completed; the group rollup aggregates across members. Optionally precompute a daily_completion materialized view (user_id, group_id, date, pct) for scale.</w:t>
+        <w:t xml:space="preserve"> needs no new table — derived from logs (count per user / item / date) vs each item's target_count: a day's completion % = closed rings ÷ total tasks; the 30-day band (personal/admin) = % of the last 30 days fully completed, the 90-day rollup aggregates across members (the North Star). 7-day and personal 90-day windows were dropped (D28). Admin proxy-logging (D29) writes logs.logged_by, each proxy edit backed by an audit_log row. Optionally precompute a daily_completion materialized view (user_id, group_id, date, pct) for scale.</w:t>
       </w:r>
     </w:p>
     <w:p>

</xml_diff>

<commit_message>
docs(cet-2): clarity-check doc realignment — daily_completion, hardened RLS snippets, D34 sync; 0006 applied to cloud
- migration doc: stale D18 header replaced; daily_completion corrected to
  the real 90-day rollup table + pg_cron write-before-prune (D31/D34);
  §4 snippets upgraded to the hardened 0003 pattern + explicit-grants
  rule; groups insert corrected to RPC-only; reminders.on -> enabled
  (reserved word); addUserToGroup marked dropped (D34)
- PRD §6: timezone column (D34), reminders enabled; .docx regenerated
- build plan: open decisions -> LOCKED (D34); standard #6 explicit
  grants; M2/M3/M6 updated
- STATUS: clarity check + 0006 recorded; cloud apply verified (matrices
  identical, history 6=6, advisors clean)
- gitignore machine-local artifacts (.claude/skills, supabase/snippets)

Co-Authored-By: Claude Opus 4.8 <noreply@anthropic.com>
</commit_message>
<xml_diff>
--- a/docs/PRD.docx
+++ b/docs/PRD.docx
@@ -1891,7 +1891,7 @@
       </w:r>
       <w:r>
         <w:rPr/>
-        <w:t xml:space="preserve">id, name, avatar (Supabase Auth). No app-level admin flag; one out-of-band is_super_admin (D27, granted only in Supabase — recovery + moderation).</w:t>
+        <w:t xml:space="preserve">id, name, avatar, timezone (each member's day closes at their own midnight — D34) (Supabase Auth). No app-level admin flag; one out-of-band is_super_admin (D27, granted only in Supabase — recovery + moderation).</w:t>
       </w:r>
     </w:p>
     <w:p>
@@ -2011,7 +2011,7 @@
       </w:r>
       <w:r>
         <w:rPr/>
-        <w:t xml:space="preserve">user_id, task_id, time (HH:MM), on — personal per-task custom reminder times (D30)</w:t>
+        <w:t xml:space="preserve">user_id, task_id, time (HH:MM), enabled — personal per-task custom reminder times (D30)</w:t>
       </w:r>
     </w:p>
     <w:p>

</xml_diff>

<commit_message>
docs(d35): one invite namespace — reusable unless email-locked; M2 status
- STATUS: D35 logged; M2 build entry (verification pending — Docker was
  down); CET-4/CET-5 rows → in progress; old repo archived
- PRD §6 + .docx: groups lose invite_code; invites carry the
  reusable-vs-single-use semantics (script content synced)
- migration doc: invites schema matches 0007 (nullable lowercase email,
  DB-minted code); memberships insert = RPC-only; invites policy row

Co-Authored-By: Claude Opus 4.8 <noreply@anthropic.com>
</commit_message>
<xml_diff>
--- a/docs/PRD.docx
+++ b/docs/PRD.docx
@@ -1911,7 +1911,7 @@
       </w:r>
       <w:r>
         <w:rPr/>
-        <w:t xml:space="preserve">id, name, invite_code, created_by = the owner (authoritative; updated on transfer / succession)</w:t>
+        <w:t xml:space="preserve">id, name, created_by = the owner (authoritative; updated on transfer / succession). No group-level invite code — joining goes through invites only (D35)</w:t>
       </w:r>
     </w:p>
     <w:p>
@@ -1951,7 +1951,7 @@
       </w:r>
       <w:r>
         <w:rPr/>
-        <w:t xml:space="preserve">id, group_id, email (optional — locks the invite to a verified sign-in email, enforced without sending anything), role (admin | member), code — shareable link/code invites (/join/&lt;code&gt;; admin shares the link themselves; accept → a membership). Email delivery of invites = later nice-to-have (needs Resend + a domain)</w:t>
+        <w:t xml:space="preserve">id, group_id, email (optional — locks the invite to a verified sign-in email, enforced without sending anything), role (admin | member), code (DB-generated) — shareable link/code invites (/join/&lt;code&gt;; admin shares the link themselves; accept → a membership). Open invites (no email) are reusable until revoked — one link serves a whole halaqah; email-locked invites are single-use, deleted on accept (D35). Email delivery of invites = later nice-to-have (needs Resend + a domain)</w:t>
       </w:r>
     </w:p>
     <w:p>

</xml_diff>